<commit_message>
Docs: update spec (v3.8) and Word doc for 3 new tools + v1.0.3 extension
- Spec: 68→71 tools, Developer Utilities 14→17, ext v1.0.2→v1.0.3
- Spec: 3 new rows in Developer Utilities table, status line updated to v3.8
- Word doc: 9 paragraph replacements (68→71, v1.0.2→v1.0.3)
- Word doc: 3 rows added to developer tools table + Appendix C URL table
- Word doc: turndown added to JS libraries table

Co-Authored-By: Claude Sonnet 4.6 <noreply@anthropic.com>
</commit_message>
<xml_diff>
--- a/TinkrKit_Technical_Documentation.docx
+++ b/TinkrKit_Technical_Documentation.docx
@@ -2784,6 +2784,28 @@
           </w:p>
         </w:tc>
       </w:tr>
+      <w:tr>
+        <w:tc>
+          <w:tcPr>
+            <w:tcW w:type="dxa" w:w="3120"/>
+          </w:tcPr>
+          <w:p>
+            <w:r>
+              <w:t>turndown</w:t>
+            </w:r>
+          </w:p>
+        </w:tc>
+        <w:tc>
+          <w:tcPr>
+            <w:tcW w:type="dxa" w:w="6240"/>
+          </w:tcPr>
+          <w:p>
+            <w:r>
+              <w:t>HTML → Markdown conversion (dynamic import, client-side)</w:t>
+            </w:r>
+          </w:p>
+        </w:tc>
+      </w:tr>
     </w:tbl>
     <w:p>
       <w:pPr>
@@ -2820,7 +2842,7 @@
           <w:sz w:val="20"/>
           <w:szCs w:val="20"/>
         </w:rPr>
-        <w:t>Because all 68 tools run in the browser, there are zero compute costs. The only server-side work is blog reads from Supabase and admin actions — both within free-tier limits.</w:t>
+        <w:t>Because all 71 tools run in the browser, there are zero compute costs. The only server-side work is blog reads from Supabase and admin actions — both within free-tier limits.</w:t>
       </w:r>
     </w:p>
     <w:p>
@@ -6940,7 +6962,7 @@
           <w:sz w:val="18"/>
           <w:szCs w:val="18"/>
         </w:rPr>
-        <w:t>│   ├── tools-config.ts             # All 68 tools metadata</w:t>
+        <w:t>│   ├── tools-config.ts             # All 71 tools metadata</w:t>
       </w:r>
     </w:p>
     <w:p>
@@ -7038,7 +7060,7 @@
           <w:sz w:val="18"/>
           <w:szCs w:val="18"/>
         </w:rPr>
-        <w:t>│   ├── manifest.json               # v1.0.2; storage + contextMenus</w:t>
+        <w:t>│   ├── manifest.json               # v1.0.3; storage + contextMenus</w:t>
       </w:r>
     </w:p>
     <w:p>
@@ -11120,7 +11142,7 @@
           <w:sz w:val="22"/>
           <w:szCs w:val="22"/>
         </w:rPr>
-        <w:t xml:space="preserve"> is the outermost wrapper for every tool page. It accepts the tool's slug and automatically renders (in order, below the tool's main UI): SocialShare buttons, BuyMeCoffee widget, HowToUse accordion, KeywordTags, RelatedTools grid, RelatedPosts list, and an AdSlot. This ensures consistent structure across all 68 tools without any per-tool copy-paste.</w:t>
+        <w:t xml:space="preserve"> is the outermost wrapper for every tool page. It accepts the tool's slug and automatically renders (in order, below the tool's main UI): SocialShare buttons, BuyMeCoffee widget, HowToUse accordion, KeywordTags, RelatedTools grid, RelatedPosts list, and an AdSlot. This ensures consistent structure across all 71 tools without any per-tool copy-paste.</w:t>
       </w:r>
     </w:p>
     <w:p>
@@ -12138,7 +12160,7 @@
           <w:sz w:val="22"/>
           <w:szCs w:val="22"/>
         </w:rPr>
-        <w:t xml:space="preserve">The homepage search bar filters all 68 tools in real-time as the user types. It is implemented as a client-side filter over the </w:t>
+        <w:t xml:space="preserve">The homepage search bar filters all 71 tools in real-time as the user types. It is implemented as a client-side filter over the </w:t>
       </w:r>
       <w:r>
         <w:rPr>
@@ -19053,7 +19075,7 @@
           <w:sz w:val="22"/>
           <w:szCs w:val="22"/>
         </w:rPr>
-        <w:t xml:space="preserve">The popup loads all 68 tools from an inline JavaScript array (not fetched from the website) to ensure it works </w:t>
+        <w:t xml:space="preserve">The popup loads all 71 tools from an inline JavaScript array (not fetched from the website) to ensure it works </w:t>
       </w:r>
       <w:r>
         <w:rPr>
@@ -20022,6 +20044,72 @@
           </w:p>
         </w:tc>
       </w:tr>
+      <w:tr>
+        <w:tc>
+          <w:tcPr>
+            <w:tcW w:type="dxa" w:w="3120"/>
+          </w:tcPr>
+          <w:p>
+            <w:r>
+              <w:t>/developer/sql-dialect-converter</w:t>
+            </w:r>
+          </w:p>
+        </w:tc>
+        <w:tc>
+          <w:tcPr>
+            <w:tcW w:type="dxa" w:w="6240"/>
+          </w:tcPr>
+          <w:p>
+            <w:r>
+              <w:t>SQL Dialect Converter</w:t>
+            </w:r>
+          </w:p>
+        </w:tc>
+      </w:tr>
+      <w:tr>
+        <w:tc>
+          <w:tcPr>
+            <w:tcW w:type="dxa" w:w="3120"/>
+          </w:tcPr>
+          <w:p>
+            <w:r>
+              <w:t>/developer/markdown-to-html</w:t>
+            </w:r>
+          </w:p>
+        </w:tc>
+        <w:tc>
+          <w:tcPr>
+            <w:tcW w:type="dxa" w:w="6240"/>
+          </w:tcPr>
+          <w:p>
+            <w:r>
+              <w:t>Markdown to HTML</w:t>
+            </w:r>
+          </w:p>
+        </w:tc>
+      </w:tr>
+      <w:tr>
+        <w:tc>
+          <w:tcPr>
+            <w:tcW w:type="dxa" w:w="3120"/>
+          </w:tcPr>
+          <w:p>
+            <w:r>
+              <w:t>/developer/html-to-markdown</w:t>
+            </w:r>
+          </w:p>
+        </w:tc>
+        <w:tc>
+          <w:tcPr>
+            <w:tcW w:type="dxa" w:w="6240"/>
+          </w:tcPr>
+          <w:p>
+            <w:r>
+              <w:t>HTML to Markdown</w:t>
+            </w:r>
+          </w:p>
+        </w:tc>
+      </w:tr>
     </w:tbl>
     <w:p>
       <w:pPr>
@@ -20310,7 +20398,7 @@
                 <w:sz w:val="19"/>
                 <w:szCs w:val="19"/>
               </w:rPr>
-              <w:t>Phase 1 (v1.0.2 — Current) / Phase 2 (Planned)</w:t>
+              <w:t>Phase 1 (v1.0.3 — Current) / Phase 2 (Planned)</w:t>
             </w:r>
           </w:p>
         </w:tc>
@@ -21115,7 +21203,7 @@
           <w:sz w:val="18"/>
           <w:szCs w:val="18"/>
         </w:rPr>
-        <w:t xml:space="preserve">zip -r ../tinkrkit-extension-v1.0.2.zip . -x "*.DS_Store" -x "__MACOSX/*"</w:t>
+        <w:t>zip -r ../tinkrkit-extension-v1.0.3.zip . -x "*.DS_Store" -x "__MACOSX/*"</w:t>
       </w:r>
     </w:p>
     <w:p>
@@ -21389,7 +21477,7 @@
           <w:sz w:val="22"/>
           <w:szCs w:val="22"/>
         </w:rPr>
-        <w:t>The review process for version 1.0.2 (after removing the "tabs" permission) involves an automated policy check followed by a manual human review if the automated check flags anything. Common rejection reasons for Chrome extensions include: overly broad permissions, missing privacy policy, misleading descriptions, and use of external JavaScript. TinkrKit's extension has none of these issues in v1.0.2.</w:t>
+        <w:t>The review process for version 1.0.3 (after removing the "tabs" permission) involves an automated policy check followed by a manual human review if the automated check flags anything. Common rejection reasons for Chrome extensions include: overly broad permissions, missing privacy policy, misleading descriptions, and use of external JavaScript. TinkrKit's extension has none of these issues in v1.0.3.</w:t>
       </w:r>
     </w:p>
     <w:p>
@@ -33243,7 +33331,7 @@
           <w:sz w:val="22"/>
           <w:szCs w:val="22"/>
         </w:rPr>
-        <w:t>Preparation checklist: make the site fully polished before launch (no broken pages, responsive on mobile, all 68 tools working), prepare a 30-second GIF or video showing the site in action, write a launch post explaining the story behind the product, recruit a hunter (or launch yourself), and build an email list or Twitter following to drive first-hour upvotes.</w:t>
+        <w:t>Preparation checklist: make the site fully polished before launch (no broken pages, responsive on mobile, all 71 tools working), prepare a 30-second GIF or video showing the site in action, write a launch post explaining the story behind the product, recruit a hunter (or launch yourself), and build an email list or Twitter following to drive first-hour upvotes.</w:t>
       </w:r>
     </w:p>
     <w:p>
@@ -41890,6 +41978,102 @@
                 <w:szCs w:val="19"/>
               </w:rPr>
               <w:t xml:space="preserve">100,000</w:t>
+            </w:r>
+          </w:p>
+        </w:tc>
+      </w:tr>
+      <w:tr>
+        <w:tc>
+          <w:tcPr>
+            <w:tcW w:type="dxa" w:w="2600"/>
+          </w:tcPr>
+          <w:p>
+            <w:r>
+              <w:t>SQL Dialect Converter</w:t>
+            </w:r>
+          </w:p>
+        </w:tc>
+        <w:tc>
+          <w:tcPr>
+            <w:tcW w:type="dxa" w:w="3880"/>
+          </w:tcPr>
+          <w:p>
+            <w:r>
+              <w:t>/developer/sql-dialect-converter</w:t>
+            </w:r>
+          </w:p>
+        </w:tc>
+        <w:tc>
+          <w:tcPr>
+            <w:tcW w:type="dxa" w:w="2880"/>
+          </w:tcPr>
+          <w:p>
+            <w:r>
+              <w:t>✅ Built</w:t>
+            </w:r>
+          </w:p>
+        </w:tc>
+      </w:tr>
+      <w:tr>
+        <w:tc>
+          <w:tcPr>
+            <w:tcW w:type="dxa" w:w="2600"/>
+          </w:tcPr>
+          <w:p>
+            <w:r>
+              <w:t>Markdown to HTML</w:t>
+            </w:r>
+          </w:p>
+        </w:tc>
+        <w:tc>
+          <w:tcPr>
+            <w:tcW w:type="dxa" w:w="3880"/>
+          </w:tcPr>
+          <w:p>
+            <w:r>
+              <w:t>/developer/markdown-to-html</w:t>
+            </w:r>
+          </w:p>
+        </w:tc>
+        <w:tc>
+          <w:tcPr>
+            <w:tcW w:type="dxa" w:w="2880"/>
+          </w:tcPr>
+          <w:p>
+            <w:r>
+              <w:t>✅ Built</w:t>
+            </w:r>
+          </w:p>
+        </w:tc>
+      </w:tr>
+      <w:tr>
+        <w:tc>
+          <w:tcPr>
+            <w:tcW w:type="dxa" w:w="2600"/>
+          </w:tcPr>
+          <w:p>
+            <w:r>
+              <w:t>HTML to Markdown</w:t>
+            </w:r>
+          </w:p>
+        </w:tc>
+        <w:tc>
+          <w:tcPr>
+            <w:tcW w:type="dxa" w:w="3880"/>
+          </w:tcPr>
+          <w:p>
+            <w:r>
+              <w:t>/developer/html-to-markdown</w:t>
+            </w:r>
+          </w:p>
+        </w:tc>
+        <w:tc>
+          <w:tcPr>
+            <w:tcW w:type="dxa" w:w="2880"/>
+          </w:tcPr>
+          <w:p>
+            <w:r>
+              <w:t>✅ Built</w:t>
             </w:r>
           </w:p>
         </w:tc>

</xml_diff>